<commit_message>
Format PR6 report section order
Co-authored-by: alexproxor <alexproxor@users.noreply.github.com>
</commit_message>
<xml_diff>
--- a/Прохоров.А.Ф_ПР6.docx
+++ b/Прохоров.А.Ф_ПР6.docx
@@ -1191,7 +1191,7 @@
     </w:p>
     <w:p>
       <w:pPr>
-        <w:spacing w:after="0" w:line="360" w:lineRule="auto"/>
+        <w:spacing w:after="120" w:line="360" w:lineRule="auto" w:before="0"/>
         <w:jc w:val="center"/>
         <w:rPr>
           <w:rFonts w:ascii="Times New Roman" w:hAnsi="Times New Roman" w:cs="Times New Roman"/>
@@ -1202,12 +1202,10 @@
       </w:pPr>
       <w:r>
         <w:rPr>
-          <w:rFonts w:ascii="Times New Roman" w:hAnsi="Times New Roman" w:cs="Times New Roman"/>
+          <w:rFonts w:ascii="Times New Roman" w:hAnsi="Times New Roman"/>
           <w:b/>
           <w:sz w:val="28"/>
-          <w:szCs w:val="28"/>
-        </w:rPr>
-        <w:lastRenderedPageBreak/>
+        </w:rPr>
         <w:t>Введение</w:t>
       </w:r>
     </w:p>
@@ -1445,7 +1443,20 @@
     </w:p>
     <w:p>
       <w:pPr>
-        <w:spacing w:after="0" w:line="360" w:lineRule="auto"/>
+        <w:spacing w:before="0" w:after="120"/>
+      </w:pPr>
+      <w:r>
+        <w:rPr>
+          <w:rFonts w:ascii="Times New Roman" w:hAnsi="Times New Roman"/>
+          <w:b/>
+          <w:sz w:val="28"/>
+        </w:rPr>
+        <w:t>1. Структура проекта.</w:t>
+      </w:r>
+    </w:p>
+    <w:p>
+      <w:pPr>
+        <w:spacing w:after="120" w:line="360" w:lineRule="auto" w:before="0"/>
         <w:jc w:val="center"/>
         <w:rPr>
           <w:rFonts w:ascii="Times New Roman" w:hAnsi="Times New Roman" w:cs="Times New Roman"/>
@@ -1456,13 +1467,11 @@
       </w:pPr>
       <w:r>
         <w:rPr>
-          <w:rFonts w:ascii="Times New Roman" w:hAnsi="Times New Roman" w:cs="Times New Roman"/>
+          <w:rFonts w:ascii="Times New Roman" w:hAnsi="Times New Roman"/>
           <w:b/>
           <w:sz w:val="28"/>
-          <w:szCs w:val="28"/>
-        </w:rPr>
-        <w:lastRenderedPageBreak/>
-        <w:t>Состав и иерархия работ проекта</w:t>
+        </w:rPr>
+        <w:t>1.1. Состав, иерархия и характеристика работ проекта.</w:t>
       </w:r>
     </w:p>
     <w:p>
@@ -6608,7 +6617,7 @@
     </w:p>
     <w:p>
       <w:pPr>
-        <w:spacing w:after="0" w:line="360" w:lineRule="auto"/>
+        <w:spacing w:after="120" w:line="360" w:lineRule="auto" w:before="0"/>
         <w:jc w:val="center"/>
         <w:rPr>
           <w:rFonts w:ascii="Times New Roman" w:hAnsi="Times New Roman" w:cs="Times New Roman"/>
@@ -6619,13 +6628,11 @@
       </w:pPr>
       <w:r>
         <w:rPr>
-          <w:rFonts w:ascii="Times New Roman" w:hAnsi="Times New Roman" w:cs="Times New Roman"/>
+          <w:rFonts w:ascii="Times New Roman" w:hAnsi="Times New Roman"/>
           <w:b/>
           <w:sz w:val="28"/>
-          <w:szCs w:val="28"/>
-        </w:rPr>
-        <w:lastRenderedPageBreak/>
-        <w:t>Установление зависимостей работ и типов связей между ними</w:t>
+        </w:rPr>
+        <w:t>1.2. Зависимости и связи между работами.</w:t>
       </w:r>
     </w:p>
     <w:p>
@@ -8439,7 +8446,7 @@
     </w:p>
     <w:p>
       <w:pPr>
-        <w:spacing w:after="0" w:line="360" w:lineRule="auto"/>
+        <w:spacing w:after="120" w:line="360" w:lineRule="auto" w:before="0"/>
         <w:jc w:val="center"/>
         <w:rPr>
           <w:rFonts w:ascii="Times New Roman" w:hAnsi="Times New Roman" w:cs="Times New Roman"/>
@@ -8450,13 +8457,11 @@
       </w:pPr>
       <w:r>
         <w:rPr>
-          <w:rFonts w:ascii="Times New Roman" w:hAnsi="Times New Roman" w:cs="Times New Roman"/>
+          <w:rFonts w:ascii="Times New Roman" w:hAnsi="Times New Roman"/>
           <w:b/>
           <w:sz w:val="28"/>
-          <w:szCs w:val="28"/>
-        </w:rPr>
-        <w:lastRenderedPageBreak/>
-        <w:t>Построение сетевой модели</w:t>
+        </w:rPr>
+        <w:t>1.3. Сетевой график.</w:t>
       </w:r>
     </w:p>
     <w:p>
@@ -8767,7 +8772,7 @@
     </w:p>
     <w:p>
       <w:pPr>
-        <w:spacing w:after="0" w:line="360" w:lineRule="auto"/>
+        <w:spacing w:after="120" w:line="360" w:lineRule="auto" w:before="0"/>
         <w:jc w:val="center"/>
         <w:rPr>
           <w:rFonts w:ascii="Times New Roman" w:hAnsi="Times New Roman" w:cs="Times New Roman"/>
@@ -8778,13 +8783,11 @@
       </w:pPr>
       <w:r>
         <w:rPr>
-          <w:rFonts w:ascii="Times New Roman" w:hAnsi="Times New Roman" w:cs="Times New Roman"/>
+          <w:rFonts w:ascii="Times New Roman" w:hAnsi="Times New Roman"/>
           <w:b/>
           <w:sz w:val="28"/>
-          <w:szCs w:val="28"/>
-        </w:rPr>
-        <w:lastRenderedPageBreak/>
-        <w:t>Назначение ресурсов на выполняемые работы</w:t>
+        </w:rPr>
+        <w:t>2. Ресурсы проекта.</w:t>
       </w:r>
     </w:p>
     <w:p>
@@ -8808,6 +8811,7 @@
     </w:p>
     <w:p>
       <w:pPr>
+        <w:spacing w:before="0" w:after="120"/>
         <w:rPr>
           <w:rFonts w:ascii="Times New Roman" w:hAnsi="Times New Roman" w:cs="Times New Roman"/>
           <w:sz w:val="28"/>
@@ -8816,12 +8820,11 @@
       </w:pPr>
       <w:r>
         <w:rPr>
-          <w:rFonts w:ascii="Times New Roman" w:hAnsi="Times New Roman" w:cs="Times New Roman"/>
+          <w:rFonts w:ascii="Times New Roman" w:hAnsi="Times New Roman"/>
           <w:b/>
           <w:sz w:val="28"/>
-          <w:szCs w:val="28"/>
-        </w:rPr>
-        <w:t>4.3.1. Временные ресурсы</w:t>
+        </w:rPr>
+        <w:t>Временные ресурсы</w:t>
       </w:r>
     </w:p>
     <w:p>
@@ -11475,6 +11478,7 @@
     </w:p>
     <w:p>
       <w:pPr>
+        <w:spacing w:before="0" w:after="120"/>
         <w:rPr>
           <w:rFonts w:ascii="Times New Roman" w:hAnsi="Times New Roman" w:cs="Times New Roman"/>
           <w:sz w:val="28"/>
@@ -11483,13 +11487,11 @@
       </w:pPr>
       <w:r>
         <w:rPr>
-          <w:rFonts w:ascii="Times New Roman" w:hAnsi="Times New Roman" w:cs="Times New Roman"/>
+          <w:rFonts w:ascii="Times New Roman" w:hAnsi="Times New Roman"/>
           <w:b/>
           <w:sz w:val="28"/>
-          <w:szCs w:val="28"/>
-        </w:rPr>
-        <w:lastRenderedPageBreak/>
-        <w:t>4.3.2. Трудовые, материальные и финансовые ресурсы</w:t>
+        </w:rPr>
+        <w:t>Трудовые, материальные и финансовые ресурсы</w:t>
       </w:r>
     </w:p>
     <w:p>
@@ -13751,9 +13753,8 @@
     </w:p>
     <w:p>
       <w:pPr>
-        <w:pStyle w:val="a3"/>
-        <w:spacing w:after="0" w:line="360" w:lineRule="auto"/>
-        <w:ind w:left="0"/>
+        <w:spacing w:after="120" w:line="360" w:lineRule="auto" w:before="0"/>
+        <w:ind/>
         <w:jc w:val="center"/>
         <w:rPr>
           <w:rFonts w:ascii="Times New Roman" w:hAnsi="Times New Roman" w:cs="Times New Roman"/>
@@ -13763,11 +13764,11 @@
       </w:pPr>
       <w:r>
         <w:rPr>
-          <w:rFonts w:ascii="Times New Roman" w:hAnsi="Times New Roman" w:cs="Times New Roman"/>
+          <w:rFonts w:ascii="Times New Roman" w:hAnsi="Times New Roman"/>
           <w:b/>
           <w:sz w:val="28"/>
         </w:rPr>
-        <w:t>Расчёт плановых характеристик проекта</w:t>
+        <w:t>3. Расчет плановых характеристик проекта.</w:t>
       </w:r>
     </w:p>
     <w:p>
@@ -13965,9 +13966,8 @@
     </w:p>
     <w:p>
       <w:pPr>
-        <w:pStyle w:val="a3"/>
-        <w:spacing w:after="0" w:line="360" w:lineRule="auto"/>
-        <w:ind w:left="0"/>
+        <w:spacing w:after="120" w:line="360" w:lineRule="auto" w:before="0"/>
+        <w:ind/>
         <w:jc w:val="center"/>
         <w:rPr>
           <w:rFonts w:ascii="Times New Roman" w:hAnsi="Times New Roman" w:cs="Times New Roman"/>
@@ -13977,11 +13977,10 @@
       </w:pPr>
       <w:r>
         <w:rPr>
-          <w:rFonts w:ascii="Times New Roman" w:hAnsi="Times New Roman" w:cs="Times New Roman"/>
+          <w:rFonts w:ascii="Times New Roman" w:hAnsi="Times New Roman"/>
           <w:b/>
           <w:sz w:val="28"/>
         </w:rPr>
-        <w:lastRenderedPageBreak/>
         <w:t>Выводы</w:t>
       </w:r>
     </w:p>
@@ -14110,7 +14109,8 @@
     </w:p>
     <w:p>
       <w:pPr>
-        <w:ind w:firstLine="708"/>
+        <w:spacing w:before="0" w:after="120"/>
+        <w:ind/>
         <w:rPr>
           <w:b/>
           <w:sz w:val="28"/>
@@ -14119,11 +14119,10 @@
       </w:pPr>
       <w:r>
         <w:rPr>
+          <w:rFonts w:ascii="Times New Roman" w:hAnsi="Times New Roman"/>
           <w:b/>
           <w:sz w:val="28"/>
-          <w:szCs w:val="28"/>
-        </w:rPr>
-        <w:lastRenderedPageBreak/>
+        </w:rPr>
         <w:t>Приложение А.</w:t>
       </w:r>
     </w:p>
@@ -14240,7 +14239,8 @@
     </w:p>
     <w:p>
       <w:pPr>
-        <w:ind w:firstLine="708"/>
+        <w:spacing w:before="0" w:after="120"/>
+        <w:ind/>
         <w:rPr>
           <w:b/>
           <w:sz w:val="28"/>
@@ -14249,28 +14249,11 @@
       </w:pPr>
       <w:r>
         <w:rPr>
+          <w:rFonts w:ascii="Times New Roman" w:hAnsi="Times New Roman"/>
           <w:b/>
           <w:sz w:val="28"/>
-          <w:szCs w:val="28"/>
-        </w:rPr>
-        <w:lastRenderedPageBreak/>
-        <w:t xml:space="preserve">Приложение </w:t>
-      </w:r>
-      <w:r>
-        <w:rPr>
-          <w:b/>
-          <w:sz w:val="28"/>
-          <w:szCs w:val="28"/>
-        </w:rPr>
-        <w:t>Б</w:t>
-      </w:r>
-      <w:r>
-        <w:rPr>
-          <w:b/>
-          <w:sz w:val="28"/>
-          <w:szCs w:val="28"/>
-        </w:rPr>
-        <w:t>.</w:t>
+        </w:rPr>
+        <w:t>Приложение Б.</w:t>
       </w:r>
     </w:p>
     <w:p>
@@ -14339,7 +14322,8 @@
     </w:p>
     <w:p>
       <w:pPr>
-        <w:ind w:firstLine="708"/>
+        <w:spacing w:before="0" w:after="120"/>
+        <w:ind/>
         <w:rPr>
           <w:b/>
           <w:sz w:val="28"/>
@@ -14348,28 +14332,11 @@
       </w:pPr>
       <w:r>
         <w:rPr>
+          <w:rFonts w:ascii="Times New Roman" w:hAnsi="Times New Roman"/>
           <w:b/>
           <w:sz w:val="28"/>
-          <w:szCs w:val="28"/>
-        </w:rPr>
-        <w:lastRenderedPageBreak/>
-        <w:t xml:space="preserve">Приложение </w:t>
-      </w:r>
-      <w:r>
-        <w:rPr>
-          <w:b/>
-          <w:sz w:val="28"/>
-          <w:szCs w:val="28"/>
-        </w:rPr>
-        <w:t>Г</w:t>
-      </w:r>
-      <w:r>
-        <w:rPr>
-          <w:b/>
-          <w:sz w:val="28"/>
-          <w:szCs w:val="28"/>
-        </w:rPr>
-        <w:t>.</w:t>
+        </w:rPr>
+        <w:t>Приложение Г.</w:t>
       </w:r>
     </w:p>
     <w:p>
@@ -14444,6 +14411,7 @@
     </w:p>
     <w:p>
       <w:pPr>
+        <w:spacing w:before="0" w:after="120"/>
         <w:rPr>
           <w:rFonts w:ascii="Times New Roman" w:hAnsi="Times New Roman" w:cs="Times New Roman"/>
           <w:b/>
@@ -14454,13 +14422,10 @@
       </w:pPr>
       <w:r>
         <w:rPr>
-          <w:rFonts w:ascii="Times New Roman" w:hAnsi="Times New Roman" w:cs="Times New Roman"/>
+          <w:rFonts w:ascii="Times New Roman" w:hAnsi="Times New Roman"/>
           <w:b/>
-          <w:bCs/>
-          <w:sz w:val="32"/>
-          <w:szCs w:val="32"/>
-        </w:rPr>
-        <w:lastRenderedPageBreak/>
+          <w:sz w:val="28"/>
+        </w:rPr>
         <w:t>Лист ресурсов</w:t>
       </w:r>
     </w:p>
@@ -14661,6 +14626,7 @@
     </w:p>
     <w:p>
       <w:pPr>
+        <w:spacing w:before="0" w:after="120"/>
         <w:rPr>
           <w:rFonts w:ascii="Times New Roman" w:hAnsi="Times New Roman" w:cs="Times New Roman"/>
           <w:b/>
@@ -14671,38 +14637,11 @@
       </w:pPr>
       <w:r>
         <w:rPr>
-          <w:rFonts w:ascii="Times New Roman" w:hAnsi="Times New Roman" w:cs="Times New Roman"/>
+          <w:rFonts w:ascii="Times New Roman" w:hAnsi="Times New Roman"/>
           <w:b/>
-          <w:bCs/>
-          <w:sz w:val="32"/>
-          <w:szCs w:val="32"/>
-        </w:rPr>
-        <w:lastRenderedPageBreak/>
-        <w:t>Сетевой график (</w:t>
-      </w:r>
-      <w:proofErr w:type="spellStart"/>
-      <w:r>
-        <w:rPr>
-          <w:rFonts w:ascii="Times New Roman" w:hAnsi="Times New Roman" w:cs="Times New Roman"/>
-          <w:b/>
-          <w:bCs/>
-          <w:sz w:val="32"/>
-          <w:szCs w:val="32"/>
-          <w:lang w:val="en-US"/>
-        </w:rPr>
-        <w:t>ProjectLibre</w:t>
-      </w:r>
-      <w:proofErr w:type="spellEnd"/>
-      <w:r>
-        <w:rPr>
-          <w:rFonts w:ascii="Times New Roman" w:hAnsi="Times New Roman" w:cs="Times New Roman"/>
-          <w:b/>
-          <w:bCs/>
-          <w:sz w:val="32"/>
-          <w:szCs w:val="32"/>
-          <w:lang w:val="en-US"/>
-        </w:rPr>
-        <w:t>)</w:t>
+          <w:sz w:val="28"/>
+        </w:rPr>
+        <w:t>Сетевой график (ProjectLibre)</w:t>
       </w:r>
     </w:p>
     <w:p>
@@ -14957,6 +14896,7 @@
     </w:p>
     <w:p>
       <w:pPr>
+        <w:spacing w:before="0" w:after="120"/>
         <w:rPr>
           <w:rFonts w:ascii="Times New Roman" w:hAnsi="Times New Roman" w:cs="Times New Roman"/>
           <w:b/>
@@ -14967,13 +14907,10 @@
       </w:pPr>
       <w:r>
         <w:rPr>
-          <w:rFonts w:ascii="Times New Roman" w:hAnsi="Times New Roman" w:cs="Times New Roman"/>
+          <w:rFonts w:ascii="Times New Roman" w:hAnsi="Times New Roman"/>
           <w:b/>
-          <w:bCs/>
-          <w:sz w:val="32"/>
-          <w:szCs w:val="32"/>
-        </w:rPr>
-        <w:lastRenderedPageBreak/>
+          <w:sz w:val="28"/>
+        </w:rPr>
         <w:t>Обзорный отчет</w:t>
       </w:r>
     </w:p>
@@ -15057,6 +14994,7 @@
     </w:p>
     <w:p>
       <w:pPr>
+        <w:spacing w:before="0" w:after="120"/>
         <w:rPr>
           <w:rFonts w:ascii="Times New Roman" w:hAnsi="Times New Roman" w:cs="Times New Roman"/>
           <w:b/>
@@ -15067,13 +15005,10 @@
       </w:pPr>
       <w:r>
         <w:rPr>
-          <w:rFonts w:ascii="Times New Roman" w:hAnsi="Times New Roman" w:cs="Times New Roman"/>
+          <w:rFonts w:ascii="Times New Roman" w:hAnsi="Times New Roman"/>
           <w:b/>
-          <w:bCs/>
-          <w:sz w:val="32"/>
-          <w:szCs w:val="32"/>
-        </w:rPr>
-        <w:lastRenderedPageBreak/>
+          <w:sz w:val="28"/>
+        </w:rPr>
         <w:t>Отчет по затратам</w:t>
       </w:r>
     </w:p>
@@ -15214,6 +15149,7 @@
     </w:p>
     <w:p>
       <w:pPr>
+        <w:spacing w:before="0" w:after="120"/>
         <w:rPr>
           <w:rFonts w:ascii="Times New Roman" w:hAnsi="Times New Roman" w:cs="Times New Roman"/>
           <w:b/>
@@ -15224,13 +15160,10 @@
       </w:pPr>
       <w:r>
         <w:rPr>
-          <w:rFonts w:ascii="Times New Roman" w:hAnsi="Times New Roman" w:cs="Times New Roman"/>
+          <w:rFonts w:ascii="Times New Roman" w:hAnsi="Times New Roman"/>
           <w:b/>
-          <w:bCs/>
-          <w:sz w:val="32"/>
-          <w:szCs w:val="32"/>
-        </w:rPr>
-        <w:lastRenderedPageBreak/>
+          <w:sz w:val="28"/>
+        </w:rPr>
         <w:t>Отчет по загрузке</w:t>
       </w:r>
     </w:p>

</xml_diff>